<commit_message>
Event Handling, Interaction and Data Management
</commit_message>
<xml_diff>
--- a/documentation/logbook/_Thika-Service-Finder-Logbook .docx
+++ b/documentation/logbook/_Thika-Service-Finder-Logbook .docx
@@ -305,7 +305,7 @@
     </w:p>
     <w:sdt>
       <w:sdtPr>
-        <w:id w:val="1234738125"/>
+        <w:id w:val="1007795430"/>
         <w:docPartObj>
           <w:docPartGallery w:val="Table of Contents"/>
           <w:docPartUnique w:val="1"/>
@@ -1538,12 +1538,12 @@
           <wp:inline distB="114300" distT="114300" distL="114300" distR="114300">
             <wp:extent cx="5486400" cy="3124200"/>
             <wp:effectExtent b="0" l="0" r="0" t="0"/>
-            <wp:docPr id="1" name="image9.png"/>
+            <wp:docPr id="1" name="image10.png"/>
             <a:graphic>
               <a:graphicData uri="http://schemas.openxmlformats.org/drawingml/2006/picture">
                 <pic:pic>
                   <pic:nvPicPr>
-                    <pic:cNvPr id="0" name="image9.png"/>
+                    <pic:cNvPr id="0" name="image10.png"/>
                     <pic:cNvPicPr preferRelativeResize="0"/>
                   </pic:nvPicPr>
                   <pic:blipFill>
@@ -1790,12 +1790,12 @@
           <wp:inline distB="114300" distT="114300" distL="114300" distR="114300">
             <wp:extent cx="5486400" cy="3429000"/>
             <wp:effectExtent b="0" l="0" r="0" t="0"/>
-            <wp:docPr id="13" name="image1.png"/>
+            <wp:docPr id="11" name="image3.png"/>
             <a:graphic>
               <a:graphicData uri="http://schemas.openxmlformats.org/drawingml/2006/picture">
                 <pic:pic>
                   <pic:nvPicPr>
-                    <pic:cNvPr id="0" name="image1.png"/>
+                    <pic:cNvPr id="0" name="image3.png"/>
                     <pic:cNvPicPr preferRelativeResize="0"/>
                   </pic:nvPicPr>
                   <pic:blipFill>
@@ -2117,7 +2117,7 @@
           <wp:inline distB="114300" distT="114300" distL="114300" distR="114300">
             <wp:extent cx="6710400" cy="8051800"/>
             <wp:effectExtent b="0" l="0" r="0" t="0"/>
-            <wp:docPr id="4" name="image2.png"/>
+            <wp:docPr id="3" name="image2.png"/>
             <a:graphic>
               <a:graphicData uri="http://schemas.openxmlformats.org/drawingml/2006/picture">
                 <pic:pic>
@@ -2268,12 +2268,12 @@
           <wp:inline distB="114300" distT="114300" distL="114300" distR="114300">
             <wp:extent cx="5486400" cy="4087732"/>
             <wp:effectExtent b="0" l="0" r="0" t="0"/>
-            <wp:docPr id="8" name="image11.png"/>
+            <wp:docPr id="7" name="image9.png"/>
             <a:graphic>
               <a:graphicData uri="http://schemas.openxmlformats.org/drawingml/2006/picture">
                 <pic:pic>
                   <pic:nvPicPr>
-                    <pic:cNvPr id="0" name="image11.png"/>
+                    <pic:cNvPr id="0" name="image9.png"/>
                     <pic:cNvPicPr preferRelativeResize="0"/>
                   </pic:nvPicPr>
                   <pic:blipFill>
@@ -2346,12 +2346,12 @@
             <wp:extent cx="5486400" cy="5810250"/>
             <wp:effectExtent b="0" l="0" r="0" t="0"/>
             <wp:wrapTopAndBottom distB="114300" distT="114300"/>
-            <wp:docPr id="5" name="image10.png"/>
+            <wp:docPr id="4" name="image8.png"/>
             <a:graphic>
               <a:graphicData uri="http://schemas.openxmlformats.org/drawingml/2006/picture">
                 <pic:pic>
                   <pic:nvPicPr>
-                    <pic:cNvPr id="0" name="image10.png"/>
+                    <pic:cNvPr id="0" name="image8.png"/>
                     <pic:cNvPicPr preferRelativeResize="0"/>
                   </pic:nvPicPr>
                   <pic:blipFill>
@@ -2424,6 +2424,279 @@
           <w:bCs w:val="1"/>
           <w:sz w:val="24"/>
           <w:szCs w:val="24"/>
+        </w:rPr>
+      </w:pPr>
+      <w:r>
+        <w:rPr>
+          <w:rtl w:val="0"/>
+        </w:rPr>
+      </w:r>
+    </w:p>
+    <w:p>
+      <w:pPr>
+        <w:spacing w:after="0" w:line="276" w:lineRule="auto"/>
+        <w:rPr>
+          <w:rFonts w:ascii="Times New Roman" w:cs="Times New Roman" w:eastAsia="Times New Roman" w:hAnsi="Times New Roman"/>
+        </w:rPr>
+      </w:pPr>
+      <w:r>
+        <w:rPr>
+          <w:rtl w:val="0"/>
+        </w:rPr>
+      </w:r>
+    </w:p>
+    <w:p>
+      <w:pPr>
+        <w:spacing w:after="0" w:line="276" w:lineRule="auto"/>
+        <w:rPr>
+          <w:rFonts w:ascii="Times New Roman" w:cs="Times New Roman" w:eastAsia="Times New Roman" w:hAnsi="Times New Roman"/>
+        </w:rPr>
+      </w:pPr>
+      <w:r>
+        <w:rPr>
+          <w:rtl w:val="0"/>
+        </w:rPr>
+      </w:r>
+    </w:p>
+    <w:p>
+      <w:pPr>
+        <w:spacing w:after="0" w:line="276" w:lineRule="auto"/>
+        <w:rPr>
+          <w:rFonts w:ascii="Times New Roman" w:cs="Times New Roman" w:eastAsia="Times New Roman" w:hAnsi="Times New Roman"/>
+        </w:rPr>
+      </w:pPr>
+      <w:r>
+        <w:rPr>
+          <w:rtl w:val="0"/>
+        </w:rPr>
+      </w:r>
+    </w:p>
+    <w:p>
+      <w:pPr>
+        <w:spacing w:after="0" w:line="276" w:lineRule="auto"/>
+        <w:rPr>
+          <w:rFonts w:ascii="Times New Roman" w:cs="Times New Roman" w:eastAsia="Times New Roman" w:hAnsi="Times New Roman"/>
+        </w:rPr>
+      </w:pPr>
+      <w:r>
+        <w:rPr>
+          <w:rtl w:val="0"/>
+        </w:rPr>
+      </w:r>
+    </w:p>
+    <w:p>
+      <w:pPr>
+        <w:spacing w:after="0" w:line="276" w:lineRule="auto"/>
+        <w:rPr>
+          <w:rFonts w:ascii="Times New Roman" w:cs="Times New Roman" w:eastAsia="Times New Roman" w:hAnsi="Times New Roman"/>
+        </w:rPr>
+      </w:pPr>
+      <w:r>
+        <w:rPr>
+          <w:rtl w:val="0"/>
+        </w:rPr>
+      </w:r>
+    </w:p>
+    <w:p>
+      <w:pPr>
+        <w:spacing w:after="0" w:line="276" w:lineRule="auto"/>
+        <w:rPr>
+          <w:rFonts w:ascii="Times New Roman" w:cs="Times New Roman" w:eastAsia="Times New Roman" w:hAnsi="Times New Roman"/>
+        </w:rPr>
+      </w:pPr>
+      <w:r>
+        <w:rPr>
+          <w:rtl w:val="0"/>
+        </w:rPr>
+      </w:r>
+    </w:p>
+    <w:p>
+      <w:pPr>
+        <w:spacing w:after="0" w:line="276" w:lineRule="auto"/>
+        <w:rPr>
+          <w:rFonts w:ascii="Times New Roman" w:cs="Times New Roman" w:eastAsia="Times New Roman" w:hAnsi="Times New Roman"/>
+        </w:rPr>
+      </w:pPr>
+      <w:r>
+        <w:rPr>
+          <w:rtl w:val="0"/>
+        </w:rPr>
+      </w:r>
+    </w:p>
+    <w:p>
+      <w:pPr>
+        <w:spacing w:after="0" w:line="276" w:lineRule="auto"/>
+        <w:rPr>
+          <w:rFonts w:ascii="Times New Roman" w:cs="Times New Roman" w:eastAsia="Times New Roman" w:hAnsi="Times New Roman"/>
+        </w:rPr>
+      </w:pPr>
+      <w:r>
+        <w:rPr>
+          <w:rtl w:val="0"/>
+        </w:rPr>
+      </w:r>
+    </w:p>
+    <w:p>
+      <w:pPr>
+        <w:spacing w:after="0" w:line="276" w:lineRule="auto"/>
+        <w:rPr>
+          <w:rFonts w:ascii="Times New Roman" w:cs="Times New Roman" w:eastAsia="Times New Roman" w:hAnsi="Times New Roman"/>
+        </w:rPr>
+      </w:pPr>
+      <w:r>
+        <w:rPr>
+          <w:rtl w:val="0"/>
+        </w:rPr>
+      </w:r>
+    </w:p>
+    <w:p>
+      <w:pPr>
+        <w:spacing w:after="0" w:line="276" w:lineRule="auto"/>
+        <w:rPr>
+          <w:rFonts w:ascii="Times New Roman" w:cs="Times New Roman" w:eastAsia="Times New Roman" w:hAnsi="Times New Roman"/>
+        </w:rPr>
+      </w:pPr>
+      <w:r>
+        <w:rPr>
+          <w:rtl w:val="0"/>
+        </w:rPr>
+      </w:r>
+    </w:p>
+    <w:p>
+      <w:pPr>
+        <w:spacing w:after="0" w:line="276" w:lineRule="auto"/>
+        <w:rPr>
+          <w:rFonts w:ascii="Times New Roman" w:cs="Times New Roman" w:eastAsia="Times New Roman" w:hAnsi="Times New Roman"/>
+        </w:rPr>
+      </w:pPr>
+      <w:r>
+        <w:rPr>
+          <w:rtl w:val="0"/>
+        </w:rPr>
+      </w:r>
+    </w:p>
+    <w:p>
+      <w:pPr>
+        <w:spacing w:after="0" w:line="276" w:lineRule="auto"/>
+        <w:rPr>
+          <w:rFonts w:ascii="Times New Roman" w:cs="Times New Roman" w:eastAsia="Times New Roman" w:hAnsi="Times New Roman"/>
+        </w:rPr>
+      </w:pPr>
+      <w:r>
+        <w:rPr>
+          <w:rtl w:val="0"/>
+        </w:rPr>
+      </w:r>
+    </w:p>
+    <w:p>
+      <w:pPr>
+        <w:spacing w:after="0" w:line="276" w:lineRule="auto"/>
+        <w:rPr>
+          <w:rFonts w:ascii="Times New Roman" w:cs="Times New Roman" w:eastAsia="Times New Roman" w:hAnsi="Times New Roman"/>
+        </w:rPr>
+      </w:pPr>
+      <w:r>
+        <w:rPr>
+          <w:rtl w:val="0"/>
+        </w:rPr>
+      </w:r>
+    </w:p>
+    <w:p>
+      <w:pPr>
+        <w:spacing w:after="0" w:line="276" w:lineRule="auto"/>
+        <w:rPr>
+          <w:rFonts w:ascii="Times New Roman" w:cs="Times New Roman" w:eastAsia="Times New Roman" w:hAnsi="Times New Roman"/>
+        </w:rPr>
+      </w:pPr>
+      <w:r>
+        <w:rPr>
+          <w:rtl w:val="0"/>
+        </w:rPr>
+      </w:r>
+    </w:p>
+    <w:p>
+      <w:pPr>
+        <w:spacing w:after="0" w:line="276" w:lineRule="auto"/>
+        <w:rPr>
+          <w:rFonts w:ascii="Times New Roman" w:cs="Times New Roman" w:eastAsia="Times New Roman" w:hAnsi="Times New Roman"/>
+        </w:rPr>
+      </w:pPr>
+      <w:r>
+        <w:rPr>
+          <w:rtl w:val="0"/>
+        </w:rPr>
+      </w:r>
+    </w:p>
+    <w:p>
+      <w:pPr>
+        <w:spacing w:after="0" w:line="276" w:lineRule="auto"/>
+        <w:rPr>
+          <w:rFonts w:ascii="Times New Roman" w:cs="Times New Roman" w:eastAsia="Times New Roman" w:hAnsi="Times New Roman"/>
+        </w:rPr>
+      </w:pPr>
+      <w:r>
+        <w:rPr>
+          <w:rtl w:val="0"/>
+        </w:rPr>
+      </w:r>
+    </w:p>
+    <w:p>
+      <w:pPr>
+        <w:spacing w:after="0" w:line="276" w:lineRule="auto"/>
+        <w:rPr>
+          <w:rFonts w:ascii="Times New Roman" w:cs="Times New Roman" w:eastAsia="Times New Roman" w:hAnsi="Times New Roman"/>
+        </w:rPr>
+      </w:pPr>
+      <w:r>
+        <w:rPr>
+          <w:rtl w:val="0"/>
+        </w:rPr>
+      </w:r>
+    </w:p>
+    <w:p>
+      <w:pPr>
+        <w:spacing w:after="0" w:line="276" w:lineRule="auto"/>
+        <w:rPr>
+          <w:rFonts w:ascii="Times New Roman" w:cs="Times New Roman" w:eastAsia="Times New Roman" w:hAnsi="Times New Roman"/>
+        </w:rPr>
+      </w:pPr>
+      <w:r>
+        <w:rPr>
+          <w:rtl w:val="0"/>
+        </w:rPr>
+      </w:r>
+    </w:p>
+    <w:p>
+      <w:pPr>
+        <w:spacing w:after="0" w:line="276" w:lineRule="auto"/>
+        <w:rPr>
+          <w:rFonts w:ascii="Times New Roman" w:cs="Times New Roman" w:eastAsia="Times New Roman" w:hAnsi="Times New Roman"/>
+        </w:rPr>
+      </w:pPr>
+      <w:r>
+        <w:rPr>
+          <w:rtl w:val="0"/>
+        </w:rPr>
+      </w:r>
+    </w:p>
+    <w:p>
+      <w:pPr>
+        <w:spacing w:after="0" w:line="276" w:lineRule="auto"/>
+        <w:rPr>
+          <w:rFonts w:ascii="Times New Roman" w:cs="Times New Roman" w:eastAsia="Times New Roman" w:hAnsi="Times New Roman"/>
+        </w:rPr>
+      </w:pPr>
+      <w:r>
+        <w:rPr>
+          <w:rtl w:val="0"/>
+        </w:rPr>
+      </w:r>
+    </w:p>
+    <w:p>
+      <w:pPr>
+        <w:spacing w:after="0" w:line="276" w:lineRule="auto"/>
+        <w:rPr>
+          <w:rFonts w:ascii="Times New Roman" w:cs="Times New Roman" w:eastAsia="Times New Roman" w:hAnsi="Times New Roman"/>
         </w:rPr>
       </w:pPr>
       <w:r>
@@ -2896,12 +3169,12 @@
             <wp:extent cx="5486400" cy="5318691"/>
             <wp:effectExtent b="0" l="0" r="0" t="0"/>
             <wp:wrapTopAndBottom distB="114300" distT="114300"/>
-            <wp:docPr id="10" name="image7.png"/>
+            <wp:docPr id="9" name="image5.png"/>
             <a:graphic>
               <a:graphicData uri="http://schemas.openxmlformats.org/drawingml/2006/picture">
                 <pic:pic>
                   <pic:nvPicPr>
-                    <pic:cNvPr id="0" name="image7.png"/>
+                    <pic:cNvPr id="0" name="image5.png"/>
                     <pic:cNvPicPr preferRelativeResize="0"/>
                   </pic:nvPicPr>
                   <pic:blipFill>
@@ -3062,27 +3335,9 @@
     </w:p>
     <w:p>
       <w:pPr>
-        <w:spacing w:line="276" w:lineRule="auto"/>
-        <w:rPr>
-          <w:rFonts w:ascii="Times New Roman" w:cs="Times New Roman" w:eastAsia="Times New Roman" w:hAnsi="Times New Roman"/>
-          <w:sz w:val="26"/>
-          <w:szCs w:val="26"/>
-        </w:rPr>
-      </w:pPr>
-      <w:r>
-        <w:rPr>
-          <w:rtl w:val="0"/>
-        </w:rPr>
-      </w:r>
-    </w:p>
-    <w:p>
-      <w:pPr>
         <w:pStyle w:val="Heading1"/>
         <w:spacing w:line="276" w:lineRule="auto"/>
-        <w:rPr>
-          <w:rFonts w:ascii="Times New Roman" w:cs="Times New Roman" w:eastAsia="Times New Roman" w:hAnsi="Times New Roman"/>
-          <w:color w:val="000000"/>
-        </w:rPr>
+        <w:rPr/>
       </w:pPr>
       <w:r>
         <w:rPr>
@@ -3092,12 +3347,6 @@
         </w:rPr>
         <w:t xml:space="preserve">Week 4: Event Handling and User Interaction</w:t>
       </w:r>
-    </w:p>
-    <w:p>
-      <w:pPr>
-        <w:spacing w:line="276" w:lineRule="auto"/>
-        <w:rPr/>
-      </w:pPr>
       <w:r>
         <w:rPr>
           <w:rtl w:val="0"/>
@@ -3112,132 +3361,53 @@
           <w:color w:val="000000"/>
         </w:rPr>
       </w:pPr>
-      <w:bookmarkStart w:colFirst="0" w:colLast="0" w:name="_heading=h.xpapkty3c3wr" w:id="13"/>
+      <w:bookmarkStart w:colFirst="0" w:colLast="0" w:name="_heading=h.jjxdn2he2ej9" w:id="13"/>
       <w:bookmarkEnd w:id="13"/>
       <w:r>
         <w:rPr>
           <w:color w:val="000000"/>
-          <w:rtl w:val="0"/>
-        </w:rPr>
-        <w:t xml:space="preserve">Figure 4.1: Kotlin code for navigation events</w:t>
-      </w:r>
-    </w:p>
-    <w:p>
-      <w:pPr>
-        <w:spacing w:line="276" w:lineRule="auto"/>
-        <w:rPr>
-          <w:rFonts w:ascii="Times New Roman" w:cs="Times New Roman" w:eastAsia="Times New Roman" w:hAnsi="Times New Roman"/>
           <w:sz w:val="24"/>
           <w:szCs w:val="24"/>
-        </w:rPr>
-      </w:pPr>
-      <w:r>
-        <w:rPr>
-          <w:rtl w:val="0"/>
-        </w:rPr>
-      </w:r>
-    </w:p>
-    <w:p>
-      <w:pPr>
-        <w:spacing w:line="276" w:lineRule="auto"/>
-        <w:rPr/>
-      </w:pPr>
-      <w:r>
-        <w:rPr/>
+          <w:rtl w:val="0"/>
+        </w:rPr>
+        <w:t xml:space="preserve">Figure 4.1: Splash screen entry point</w:t>
+      </w:r>
+      <w:r>
+        <w:rPr>
+          <w:color w:val="000000"/>
+          <w:rtl w:val="0"/>
+        </w:rPr>
+        <w:br w:type="textWrapping"/>
+      </w:r>
+    </w:p>
+    <w:p>
+      <w:pPr>
+        <w:pStyle w:val="Heading4"/>
+        <w:spacing w:line="276" w:lineRule="auto"/>
+        <w:rPr>
+          <w:color w:val="000000"/>
+        </w:rPr>
+      </w:pPr>
+      <w:bookmarkStart w:colFirst="0" w:colLast="0" w:name="_heading=h.fr7t5zle5k7t" w:id="14"/>
+      <w:bookmarkEnd w:id="14"/>
+      <w:r>
+        <w:rPr>
+          <w:color w:val="000000"/>
+        </w:rPr>
         <w:drawing>
           <wp:inline distB="114300" distT="114300" distL="114300" distR="114300">
-            <wp:extent cx="6118013" cy="3429000"/>
+            <wp:extent cx="2390775" cy="5305425"/>
             <wp:effectExtent b="0" l="0" r="0" t="0"/>
-            <wp:docPr id="12" name="image13.png"/>
+            <wp:docPr id="10" name="image4.png"/>
             <a:graphic>
               <a:graphicData uri="http://schemas.openxmlformats.org/drawingml/2006/picture">
                 <pic:pic>
                   <pic:nvPicPr>
-                    <pic:cNvPr id="0" name="image13.png"/>
+                    <pic:cNvPr id="0" name="image4.png"/>
                     <pic:cNvPicPr preferRelativeResize="0"/>
                   </pic:nvPicPr>
                   <pic:blipFill>
                     <a:blip r:embed="rId14"/>
-                    <a:srcRect b="0" l="0" r="28679" t="0"/>
-                    <a:stretch>
-                      <a:fillRect/>
-                    </a:stretch>
-                  </pic:blipFill>
-                  <pic:spPr>
-                    <a:xfrm>
-                      <a:off x="0" y="0"/>
-                      <a:ext cx="6118013" cy="3429000"/>
-                    </a:xfrm>
-                    <a:prstGeom prst="rect"/>
-                    <a:ln/>
-                  </pic:spPr>
-                </pic:pic>
-              </a:graphicData>
-            </a:graphic>
-          </wp:inline>
-        </w:drawing>
-      </w:r>
-      <w:r>
-        <w:rPr>
-          <w:rtl w:val="0"/>
-        </w:rPr>
-      </w:r>
-    </w:p>
-    <w:p>
-      <w:pPr>
-        <w:spacing w:line="276" w:lineRule="auto"/>
-        <w:rPr/>
-      </w:pPr>
-      <w:r>
-        <w:rPr>
-          <w:rtl w:val="0"/>
-        </w:rPr>
-      </w:r>
-    </w:p>
-    <w:p>
-      <w:pPr>
-        <w:pStyle w:val="Heading4"/>
-        <w:spacing w:line="276" w:lineRule="auto"/>
-        <w:rPr>
-          <w:color w:val="000000"/>
-        </w:rPr>
-      </w:pPr>
-      <w:bookmarkStart w:colFirst="0" w:colLast="0" w:name="_heading=h.jjxdn2he2ej9" w:id="14"/>
-      <w:bookmarkEnd w:id="14"/>
-      <w:r>
-        <w:rPr>
-          <w:color w:val="000000"/>
-          <w:sz w:val="24"/>
-          <w:szCs w:val="24"/>
-          <w:rtl w:val="0"/>
-        </w:rPr>
-        <w:t xml:space="preserve">Figure 4.2: Splash screen entry point</w:t>
-      </w:r>
-      <w:r>
-        <w:rPr>
-          <w:color w:val="000000"/>
-          <w:rtl w:val="0"/>
-        </w:rPr>
-        <w:br w:type="textWrapping"/>
-      </w:r>
-      <w:r>
-        <w:rPr>
-          <w:color w:val="000000"/>
-        </w:rPr>
-        <w:drawing>
-          <wp:inline distB="114300" distT="114300" distL="114300" distR="114300">
-            <wp:extent cx="2390775" cy="5305425"/>
-            <wp:effectExtent b="0" l="0" r="0" t="0"/>
-            <wp:docPr id="11" name="image5.png"/>
-            <a:graphic>
-              <a:graphicData uri="http://schemas.openxmlformats.org/drawingml/2006/picture">
-                <pic:pic>
-                  <pic:nvPicPr>
-                    <pic:cNvPr id="0" name="image5.png"/>
-                    <pic:cNvPicPr preferRelativeResize="0"/>
-                  </pic:nvPicPr>
-                  <pic:blipFill>
-                    <a:blip r:embed="rId15"/>
                     <a:srcRect b="0" l="0" r="0" t="0"/>
                     <a:stretch>
                       <a:fillRect/>
@@ -3271,14 +3441,238 @@
           <w:color w:val="000000"/>
         </w:rPr>
       </w:pPr>
-      <w:bookmarkStart w:colFirst="0" w:colLast="0" w:name="_heading=h.1xpbw2jc4fpr" w:id="15"/>
+      <w:bookmarkStart w:colFirst="0" w:colLast="0" w:name="_heading=h.hgf20sl61qe4" w:id="15"/>
       <w:bookmarkEnd w:id="15"/>
       <w:r>
         <w:rPr>
-          <w:color w:val="000000"/>
-          <w:rtl w:val="0"/>
-        </w:rPr>
-        <w:t xml:space="preserve">Figure 4.3: Main dashboard interface</w:t>
+          <w:rtl w:val="0"/>
+        </w:rPr>
+      </w:r>
+    </w:p>
+    <w:p>
+      <w:pPr>
+        <w:pStyle w:val="Heading4"/>
+        <w:spacing w:line="276" w:lineRule="auto"/>
+        <w:rPr>
+          <w:color w:val="000000"/>
+        </w:rPr>
+      </w:pPr>
+      <w:bookmarkStart w:colFirst="0" w:colLast="0" w:name="_heading=h.6p4qx5nvdm0z" w:id="16"/>
+      <w:bookmarkEnd w:id="16"/>
+      <w:r>
+        <w:rPr>
+          <w:rtl w:val="0"/>
+        </w:rPr>
+      </w:r>
+    </w:p>
+    <w:p>
+      <w:pPr>
+        <w:pStyle w:val="Heading4"/>
+        <w:spacing w:line="276" w:lineRule="auto"/>
+        <w:rPr>
+          <w:color w:val="000000"/>
+        </w:rPr>
+      </w:pPr>
+      <w:bookmarkStart w:colFirst="0" w:colLast="0" w:name="_heading=h.4067fn6y5usq" w:id="17"/>
+      <w:bookmarkEnd w:id="17"/>
+      <w:r>
+        <w:rPr>
+          <w:rtl w:val="0"/>
+        </w:rPr>
+      </w:r>
+    </w:p>
+    <w:p>
+      <w:pPr>
+        <w:pStyle w:val="Heading4"/>
+        <w:spacing w:line="276" w:lineRule="auto"/>
+        <w:rPr>
+          <w:color w:val="000000"/>
+        </w:rPr>
+      </w:pPr>
+      <w:bookmarkStart w:colFirst="0" w:colLast="0" w:name="_heading=h.53n6o3t9etm" w:id="18"/>
+      <w:bookmarkEnd w:id="18"/>
+      <w:r>
+        <w:rPr>
+          <w:rtl w:val="0"/>
+        </w:rPr>
+      </w:r>
+    </w:p>
+    <w:p>
+      <w:pPr>
+        <w:pStyle w:val="Heading4"/>
+        <w:spacing w:line="276" w:lineRule="auto"/>
+        <w:rPr>
+          <w:color w:val="000000"/>
+        </w:rPr>
+      </w:pPr>
+      <w:bookmarkStart w:colFirst="0" w:colLast="0" w:name="_heading=h.kzwsf2t8o4fx" w:id="19"/>
+      <w:bookmarkEnd w:id="19"/>
+      <w:r>
+        <w:rPr>
+          <w:rtl w:val="0"/>
+        </w:rPr>
+      </w:r>
+    </w:p>
+    <w:p>
+      <w:pPr>
+        <w:pStyle w:val="Heading4"/>
+        <w:spacing w:line="276" w:lineRule="auto"/>
+        <w:rPr>
+          <w:color w:val="000000"/>
+        </w:rPr>
+      </w:pPr>
+      <w:bookmarkStart w:colFirst="0" w:colLast="0" w:name="_heading=h.5y1zwbj4jyfc" w:id="20"/>
+      <w:bookmarkEnd w:id="20"/>
+      <w:r>
+        <w:rPr>
+          <w:rtl w:val="0"/>
+        </w:rPr>
+      </w:r>
+    </w:p>
+    <w:p>
+      <w:pPr>
+        <w:pStyle w:val="Heading4"/>
+        <w:spacing w:line="276" w:lineRule="auto"/>
+        <w:rPr>
+          <w:color w:val="000000"/>
+        </w:rPr>
+      </w:pPr>
+      <w:bookmarkStart w:colFirst="0" w:colLast="0" w:name="_heading=h.vd825noma2p" w:id="21"/>
+      <w:bookmarkEnd w:id="21"/>
+      <w:r>
+        <w:rPr>
+          <w:rtl w:val="0"/>
+        </w:rPr>
+      </w:r>
+    </w:p>
+    <w:p>
+      <w:pPr>
+        <w:pStyle w:val="Heading4"/>
+        <w:spacing w:line="276" w:lineRule="auto"/>
+        <w:rPr>
+          <w:color w:val="000000"/>
+        </w:rPr>
+      </w:pPr>
+      <w:bookmarkStart w:colFirst="0" w:colLast="0" w:name="_heading=h.ae2ot27lq5ng" w:id="22"/>
+      <w:bookmarkEnd w:id="22"/>
+      <w:r>
+        <w:rPr>
+          <w:rtl w:val="0"/>
+        </w:rPr>
+      </w:r>
+    </w:p>
+    <w:p>
+      <w:pPr>
+        <w:pStyle w:val="Heading4"/>
+        <w:spacing w:line="276" w:lineRule="auto"/>
+        <w:rPr>
+          <w:color w:val="000000"/>
+        </w:rPr>
+      </w:pPr>
+      <w:bookmarkStart w:colFirst="0" w:colLast="0" w:name="_heading=h.3npk0in1e7i" w:id="23"/>
+      <w:bookmarkEnd w:id="23"/>
+      <w:r>
+        <w:rPr>
+          <w:rtl w:val="0"/>
+        </w:rPr>
+      </w:r>
+    </w:p>
+    <w:p>
+      <w:pPr>
+        <w:pStyle w:val="Heading4"/>
+        <w:spacing w:line="276" w:lineRule="auto"/>
+        <w:rPr>
+          <w:color w:val="000000"/>
+        </w:rPr>
+      </w:pPr>
+      <w:bookmarkStart w:colFirst="0" w:colLast="0" w:name="_heading=h.jrwoyctz413x" w:id="24"/>
+      <w:bookmarkEnd w:id="24"/>
+      <w:r>
+        <w:rPr>
+          <w:rtl w:val="0"/>
+        </w:rPr>
+      </w:r>
+    </w:p>
+    <w:p>
+      <w:pPr>
+        <w:pStyle w:val="Heading4"/>
+        <w:spacing w:line="276" w:lineRule="auto"/>
+        <w:rPr>
+          <w:color w:val="000000"/>
+        </w:rPr>
+      </w:pPr>
+      <w:bookmarkStart w:colFirst="0" w:colLast="0" w:name="_heading=h.ddfqa24w3u6k" w:id="25"/>
+      <w:bookmarkEnd w:id="25"/>
+      <w:r>
+        <w:rPr>
+          <w:rtl w:val="0"/>
+        </w:rPr>
+      </w:r>
+    </w:p>
+    <w:p>
+      <w:pPr>
+        <w:pStyle w:val="Heading4"/>
+        <w:spacing w:line="276" w:lineRule="auto"/>
+        <w:rPr>
+          <w:color w:val="000000"/>
+        </w:rPr>
+      </w:pPr>
+      <w:bookmarkStart w:colFirst="0" w:colLast="0" w:name="_heading=h.28mea9xzobad" w:id="26"/>
+      <w:bookmarkEnd w:id="26"/>
+      <w:r>
+        <w:rPr>
+          <w:rtl w:val="0"/>
+        </w:rPr>
+      </w:r>
+    </w:p>
+    <w:p>
+      <w:pPr>
+        <w:pStyle w:val="Heading4"/>
+        <w:spacing w:line="276" w:lineRule="auto"/>
+        <w:rPr>
+          <w:color w:val="000000"/>
+        </w:rPr>
+      </w:pPr>
+      <w:bookmarkStart w:colFirst="0" w:colLast="0" w:name="_heading=h.oknrtyhsghu2" w:id="27"/>
+      <w:bookmarkEnd w:id="27"/>
+      <w:r>
+        <w:rPr>
+          <w:rtl w:val="0"/>
+        </w:rPr>
+      </w:r>
+    </w:p>
+    <w:p>
+      <w:pPr>
+        <w:pStyle w:val="Heading4"/>
+        <w:spacing w:line="276" w:lineRule="auto"/>
+        <w:rPr>
+          <w:color w:val="000000"/>
+        </w:rPr>
+      </w:pPr>
+      <w:bookmarkStart w:colFirst="0" w:colLast="0" w:name="_heading=h.gmtcc4anhe2" w:id="28"/>
+      <w:bookmarkEnd w:id="28"/>
+      <w:r>
+        <w:rPr>
+          <w:rtl w:val="0"/>
+        </w:rPr>
+      </w:r>
+    </w:p>
+    <w:p>
+      <w:pPr>
+        <w:pStyle w:val="Heading4"/>
+        <w:spacing w:line="276" w:lineRule="auto"/>
+        <w:rPr>
+          <w:color w:val="000000"/>
+        </w:rPr>
+      </w:pPr>
+      <w:bookmarkStart w:colFirst="0" w:colLast="0" w:name="_heading=h.1xpbw2jc4fpr" w:id="29"/>
+      <w:bookmarkEnd w:id="29"/>
+      <w:r>
+        <w:rPr>
+          <w:color w:val="000000"/>
+          <w:rtl w:val="0"/>
+        </w:rPr>
+        <w:t xml:space="preserve">Figure 4.2: Main dashboard interface</w:t>
       </w:r>
     </w:p>
     <w:p>
@@ -3309,16 +3703,16 @@
           <wp:inline distB="114300" distT="114300" distL="114300" distR="114300">
             <wp:extent cx="5434445" cy="7472363"/>
             <wp:effectExtent b="0" l="0" r="0" t="0"/>
-            <wp:docPr id="7" name="image3.png"/>
+            <wp:docPr id="6" name="image1.png"/>
             <a:graphic>
               <a:graphicData uri="http://schemas.openxmlformats.org/drawingml/2006/picture">
                 <pic:pic>
                   <pic:nvPicPr>
-                    <pic:cNvPr id="0" name="image3.png"/>
+                    <pic:cNvPr id="0" name="image1.png"/>
                     <pic:cNvPicPr preferRelativeResize="0"/>
                   </pic:nvPicPr>
                   <pic:blipFill>
-                    <a:blip r:embed="rId16"/>
+                    <a:blip r:embed="rId15"/>
                     <a:srcRect b="0" l="0" r="0" t="0"/>
                     <a:stretch>
                       <a:fillRect/>
@@ -3445,6 +3839,21 @@
       </w:pPr>
       <w:r>
         <w:rPr>
+          <w:rtl w:val="0"/>
+        </w:rPr>
+      </w:r>
+    </w:p>
+    <w:p>
+      <w:pPr>
+        <w:pStyle w:val="Heading1"/>
+        <w:spacing w:line="276" w:lineRule="auto"/>
+        <w:rPr>
+          <w:rFonts w:ascii="Times New Roman" w:cs="Times New Roman" w:eastAsia="Times New Roman" w:hAnsi="Times New Roman"/>
+          <w:color w:val="000000"/>
+        </w:rPr>
+      </w:pPr>
+      <w:r>
+        <w:rPr>
           <w:rFonts w:ascii="Times New Roman" w:cs="Times New Roman" w:eastAsia="Times New Roman" w:hAnsi="Times New Roman"/>
           <w:color w:val="000000"/>
           <w:rtl w:val="0"/>
@@ -3454,11 +3863,22 @@
     </w:p>
     <w:p>
       <w:pPr>
-        <w:pStyle w:val="Heading2"/>
-        <w:spacing w:line="276" w:lineRule="auto"/>
-        <w:rPr>
-          <w:rFonts w:ascii="Times New Roman" w:cs="Times New Roman" w:eastAsia="Times New Roman" w:hAnsi="Times New Roman"/>
-          <w:color w:val="000000"/>
+        <w:spacing w:line="276" w:lineRule="auto"/>
+        <w:rPr>
+          <w:rFonts w:ascii="Times New Roman" w:cs="Times New Roman" w:eastAsia="Times New Roman" w:hAnsi="Times New Roman"/>
+        </w:rPr>
+      </w:pPr>
+      <w:r>
+        <w:rPr>
+          <w:rtl w:val="0"/>
+        </w:rPr>
+      </w:r>
+    </w:p>
+    <w:p>
+      <w:pPr>
+        <w:spacing w:line="276" w:lineRule="auto"/>
+        <w:rPr>
+          <w:rFonts w:ascii="Times New Roman" w:cs="Times New Roman" w:eastAsia="Times New Roman" w:hAnsi="Times New Roman"/>
         </w:rPr>
       </w:pPr>
       <w:r>
@@ -3475,14 +3895,39 @@
           <w:color w:val="000000"/>
         </w:rPr>
       </w:pPr>
-      <w:bookmarkStart w:colFirst="0" w:colLast="0" w:name="_heading=h.k9um8ho3ww9c" w:id="16"/>
-      <w:bookmarkEnd w:id="16"/>
-      <w:r>
-        <w:rPr>
-          <w:color w:val="000000"/>
-          <w:rtl w:val="0"/>
-        </w:rPr>
-        <w:t xml:space="preserve">Figure 5.1: Local data storage configuration</w:t>
+      <w:bookmarkStart w:colFirst="0" w:colLast="0" w:name="_heading=h.7tefz6syovss" w:id="30"/>
+      <w:bookmarkEnd w:id="30"/>
+      <w:r>
+        <w:rPr>
+          <w:b w:val="1"/>
+          <w:bCs w:val="1"/>
+          <w:color w:val="000000"/>
+          <w:rtl w:val="0"/>
+        </w:rPr>
+        <w:t xml:space="preserve">Figure 5.</w:t>
+      </w:r>
+      <w:r>
+        <w:rPr>
+          <w:color w:val="000000"/>
+          <w:rtl w:val="0"/>
+        </w:rPr>
+        <w:t xml:space="preserve">1</w:t>
+      </w:r>
+      <w:r>
+        <w:rPr>
+          <w:b w:val="1"/>
+          <w:bCs w:val="1"/>
+          <w:color w:val="000000"/>
+          <w:rtl w:val="0"/>
+        </w:rPr>
+        <w:t xml:space="preserve">:</w:t>
+      </w:r>
+      <w:r>
+        <w:rPr>
+          <w:color w:val="000000"/>
+          <w:rtl w:val="0"/>
+        </w:rPr>
+        <w:t xml:space="preserve"> BookMark.kt for persistent storage</w:t>
       </w:r>
     </w:p>
     <w:p>
@@ -3498,18 +3943,18 @@
         </w:rPr>
         <w:drawing>
           <wp:inline distB="114300" distT="114300" distL="114300" distR="114300">
-            <wp:extent cx="5486400" cy="3429000"/>
+            <wp:extent cx="3390900" cy="5619750"/>
             <wp:effectExtent b="0" l="0" r="0" t="0"/>
-            <wp:docPr id="6" name="image12.png"/>
+            <wp:docPr id="5" name="image11.png"/>
             <a:graphic>
               <a:graphicData uri="http://schemas.openxmlformats.org/drawingml/2006/picture">
                 <pic:pic>
                   <pic:nvPicPr>
-                    <pic:cNvPr id="0" name="image12.png"/>
+                    <pic:cNvPr id="0" name="image11.png"/>
                     <pic:cNvPicPr preferRelativeResize="0"/>
                   </pic:nvPicPr>
                   <pic:blipFill>
-                    <a:blip r:embed="rId17"/>
+                    <a:blip r:embed="rId16"/>
                     <a:srcRect b="0" l="0" r="0" t="0"/>
                     <a:stretch>
                       <a:fillRect/>
@@ -3518,7 +3963,7 @@
                   <pic:spPr>
                     <a:xfrm>
                       <a:off x="0" y="0"/>
-                      <a:ext cx="5486400" cy="3429000"/>
+                      <a:ext cx="3390900" cy="5619750"/>
                     </a:xfrm>
                     <a:prstGeom prst="rect"/>
                     <a:ln/>
@@ -3550,201 +3995,127 @@
     </w:p>
     <w:p>
       <w:pPr>
-        <w:pStyle w:val="Heading4"/>
-        <w:spacing w:line="276" w:lineRule="auto"/>
-        <w:rPr>
-          <w:color w:val="000000"/>
-        </w:rPr>
-      </w:pPr>
-      <w:bookmarkStart w:colFirst="0" w:colLast="0" w:name="_heading=h.7tefz6syovss" w:id="17"/>
-      <w:bookmarkEnd w:id="17"/>
-      <w:r>
-        <w:rPr>
+        <w:spacing w:line="276" w:lineRule="auto"/>
+        <w:rPr>
+          <w:rFonts w:ascii="Times New Roman" w:cs="Times New Roman" w:eastAsia="Times New Roman" w:hAnsi="Times New Roman"/>
           <w:b w:val="1"/>
           <w:bCs w:val="1"/>
-          <w:color w:val="000000"/>
-          <w:rtl w:val="0"/>
-        </w:rPr>
-        <w:t xml:space="preserve">Figure 5.2:</w:t>
-      </w:r>
-      <w:r>
-        <w:rPr>
-          <w:color w:val="000000"/>
-          <w:rtl w:val="0"/>
-        </w:rPr>
-        <w:t xml:space="preserve"> FavoritesManager.kt for persistent storage</w:t>
-      </w:r>
-    </w:p>
-    <w:p>
-      <w:pPr>
-        <w:spacing w:line="276" w:lineRule="auto"/>
-        <w:rPr>
-          <w:rFonts w:ascii="Times New Roman" w:cs="Times New Roman" w:eastAsia="Times New Roman" w:hAnsi="Times New Roman"/>
-        </w:rPr>
-      </w:pPr>
-      <w:r>
-        <w:rPr>
-          <w:rFonts w:ascii="Times New Roman" w:cs="Times New Roman" w:eastAsia="Times New Roman" w:hAnsi="Times New Roman"/>
+          <w:sz w:val="24"/>
+          <w:szCs w:val="24"/>
+        </w:rPr>
+      </w:pPr>
+      <w:r>
+        <w:rPr>
+          <w:rtl w:val="0"/>
+        </w:rPr>
+      </w:r>
+    </w:p>
+    <w:p>
+      <w:pPr>
+        <w:spacing w:line="276" w:lineRule="auto"/>
+        <w:rPr>
+          <w:rFonts w:ascii="Times New Roman" w:cs="Times New Roman" w:eastAsia="Times New Roman" w:hAnsi="Times New Roman"/>
+          <w:b w:val="1"/>
+          <w:bCs w:val="1"/>
+          <w:sz w:val="24"/>
+          <w:szCs w:val="24"/>
+        </w:rPr>
+      </w:pPr>
+      <w:r>
+        <w:rPr>
+          <w:rtl w:val="0"/>
+        </w:rPr>
+      </w:r>
+    </w:p>
+    <w:p>
+      <w:pPr>
+        <w:spacing w:line="276" w:lineRule="auto"/>
+        <w:rPr>
+          <w:rFonts w:ascii="Times New Roman" w:cs="Times New Roman" w:eastAsia="Times New Roman" w:hAnsi="Times New Roman"/>
+          <w:b w:val="1"/>
+          <w:bCs w:val="1"/>
+          <w:sz w:val="24"/>
+          <w:szCs w:val="24"/>
+        </w:rPr>
+      </w:pPr>
+      <w:r>
+        <w:rPr>
+          <w:rtl w:val="0"/>
+        </w:rPr>
+      </w:r>
+    </w:p>
+    <w:p>
+      <w:pPr>
+        <w:pStyle w:val="Heading4"/>
+        <w:spacing w:line="276" w:lineRule="auto"/>
+        <w:rPr>
+          <w:color w:val="000000"/>
+        </w:rPr>
+      </w:pPr>
+      <w:bookmarkStart w:colFirst="0" w:colLast="0" w:name="_heading=h.ndv9oaru9xol" w:id="31"/>
+      <w:bookmarkEnd w:id="31"/>
+      <w:r>
+        <w:rPr>
+          <w:b w:val="1"/>
+          <w:bCs w:val="1"/>
+          <w:color w:val="000000"/>
+          <w:rtl w:val="0"/>
+        </w:rPr>
+        <w:t xml:space="preserve">Figure 5.</w:t>
+      </w:r>
+      <w:r>
+        <w:rPr>
+          <w:color w:val="000000"/>
+          <w:rtl w:val="0"/>
+        </w:rPr>
+        <w:t xml:space="preserve">2</w:t>
+      </w:r>
+      <w:r>
+        <w:rPr>
+          <w:b w:val="1"/>
+          <w:bCs w:val="1"/>
+          <w:color w:val="000000"/>
+          <w:rtl w:val="0"/>
+        </w:rPr>
+        <w:t xml:space="preserve">:</w:t>
+      </w:r>
+      <w:r>
+        <w:rPr>
+          <w:color w:val="000000"/>
+          <w:rtl w:val="0"/>
+        </w:rPr>
+        <w:t xml:space="preserve"> Places List screen in emulator</w:t>
+      </w:r>
+    </w:p>
+    <w:p>
+      <w:pPr>
+        <w:spacing w:line="276" w:lineRule="auto"/>
+        <w:rPr>
+          <w:rFonts w:ascii="Times New Roman" w:cs="Times New Roman" w:eastAsia="Times New Roman" w:hAnsi="Times New Roman"/>
+          <w:sz w:val="24"/>
+          <w:szCs w:val="24"/>
+        </w:rPr>
+      </w:pPr>
+      <w:r>
+        <w:rPr>
+          <w:rFonts w:ascii="Times New Roman" w:cs="Times New Roman" w:eastAsia="Times New Roman" w:hAnsi="Times New Roman"/>
+          <w:sz w:val="24"/>
+          <w:szCs w:val="24"/>
         </w:rPr>
         <w:drawing>
           <wp:inline distB="114300" distT="114300" distL="114300" distR="114300">
-            <wp:extent cx="6079913" cy="4191000"/>
+            <wp:extent cx="4619625" cy="7410531"/>
             <wp:effectExtent b="0" l="0" r="0" t="0"/>
-            <wp:docPr id="3" name="image4.png"/>
+            <wp:docPr id="8" name="image7.png"/>
             <a:graphic>
               <a:graphicData uri="http://schemas.openxmlformats.org/drawingml/2006/picture">
                 <pic:pic>
                   <pic:nvPicPr>
-                    <pic:cNvPr id="0" name="image4.png"/>
+                    <pic:cNvPr id="0" name="image7.png"/>
                     <pic:cNvPicPr preferRelativeResize="0"/>
                   </pic:nvPicPr>
                   <pic:blipFill>
-                    <a:blip r:embed="rId18"/>
-                    <a:srcRect b="0" l="0" r="33360" t="0"/>
-                    <a:stretch>
-                      <a:fillRect/>
-                    </a:stretch>
-                  </pic:blipFill>
-                  <pic:spPr>
-                    <a:xfrm>
-                      <a:off x="0" y="0"/>
-                      <a:ext cx="6079913" cy="4191000"/>
-                    </a:xfrm>
-                    <a:prstGeom prst="rect"/>
-                    <a:ln/>
-                  </pic:spPr>
-                </pic:pic>
-              </a:graphicData>
-            </a:graphic>
-          </wp:inline>
-        </w:drawing>
-      </w:r>
-      <w:r>
-        <w:rPr>
-          <w:rtl w:val="0"/>
-        </w:rPr>
-      </w:r>
-    </w:p>
-    <w:p>
-      <w:pPr>
-        <w:spacing w:line="276" w:lineRule="auto"/>
-        <w:rPr>
-          <w:rFonts w:ascii="Times New Roman" w:cs="Times New Roman" w:eastAsia="Times New Roman" w:hAnsi="Times New Roman"/>
-        </w:rPr>
-      </w:pPr>
-      <w:r>
-        <w:rPr>
-          <w:rtl w:val="0"/>
-        </w:rPr>
-      </w:r>
-    </w:p>
-    <w:p>
-      <w:pPr>
-        <w:spacing w:line="276" w:lineRule="auto"/>
-        <w:rPr>
-          <w:rFonts w:ascii="Times New Roman" w:cs="Times New Roman" w:eastAsia="Times New Roman" w:hAnsi="Times New Roman"/>
-          <w:b w:val="1"/>
-          <w:bCs w:val="1"/>
-          <w:sz w:val="24"/>
-          <w:szCs w:val="24"/>
-        </w:rPr>
-      </w:pPr>
-      <w:r>
-        <w:rPr>
-          <w:rtl w:val="0"/>
-        </w:rPr>
-      </w:r>
-    </w:p>
-    <w:p>
-      <w:pPr>
-        <w:spacing w:line="276" w:lineRule="auto"/>
-        <w:rPr>
-          <w:rFonts w:ascii="Times New Roman" w:cs="Times New Roman" w:eastAsia="Times New Roman" w:hAnsi="Times New Roman"/>
-          <w:b w:val="1"/>
-          <w:bCs w:val="1"/>
-          <w:sz w:val="24"/>
-          <w:szCs w:val="24"/>
-        </w:rPr>
-      </w:pPr>
-      <w:r>
-        <w:rPr>
-          <w:rtl w:val="0"/>
-        </w:rPr>
-      </w:r>
-    </w:p>
-    <w:p>
-      <w:pPr>
-        <w:spacing w:line="276" w:lineRule="auto"/>
-        <w:rPr>
-          <w:rFonts w:ascii="Times New Roman" w:cs="Times New Roman" w:eastAsia="Times New Roman" w:hAnsi="Times New Roman"/>
-          <w:b w:val="1"/>
-          <w:bCs w:val="1"/>
-          <w:sz w:val="24"/>
-          <w:szCs w:val="24"/>
-        </w:rPr>
-      </w:pPr>
-      <w:r>
-        <w:rPr>
-          <w:rtl w:val="0"/>
-        </w:rPr>
-      </w:r>
-    </w:p>
-    <w:p>
-      <w:pPr>
-        <w:pStyle w:val="Heading4"/>
-        <w:spacing w:line="276" w:lineRule="auto"/>
-        <w:rPr>
-          <w:color w:val="000000"/>
-        </w:rPr>
-      </w:pPr>
-      <w:bookmarkStart w:colFirst="0" w:colLast="0" w:name="_heading=h.ndv9oaru9xol" w:id="18"/>
-      <w:bookmarkEnd w:id="18"/>
-      <w:r>
-        <w:rPr>
-          <w:b w:val="1"/>
-          <w:bCs w:val="1"/>
-          <w:color w:val="000000"/>
-          <w:rtl w:val="0"/>
-        </w:rPr>
-        <w:t xml:space="preserve">Figure 5.3:</w:t>
-      </w:r>
-      <w:r>
-        <w:rPr>
-          <w:color w:val="000000"/>
-          <w:rtl w:val="0"/>
-        </w:rPr>
-        <w:t xml:space="preserve"> Places List screen in emulator</w:t>
-      </w:r>
-    </w:p>
-    <w:p>
-      <w:pPr>
-        <w:spacing w:line="276" w:lineRule="auto"/>
-        <w:rPr>
-          <w:rFonts w:ascii="Times New Roman" w:cs="Times New Roman" w:eastAsia="Times New Roman" w:hAnsi="Times New Roman"/>
-          <w:sz w:val="24"/>
-          <w:szCs w:val="24"/>
-        </w:rPr>
-      </w:pPr>
-      <w:r>
-        <w:rPr>
-          <w:rFonts w:ascii="Times New Roman" w:cs="Times New Roman" w:eastAsia="Times New Roman" w:hAnsi="Times New Roman"/>
-          <w:sz w:val="24"/>
-          <w:szCs w:val="24"/>
-        </w:rPr>
-        <w:drawing>
-          <wp:inline distB="114300" distT="114300" distL="114300" distR="114300">
-            <wp:extent cx="4619625" cy="7410531"/>
-            <wp:effectExtent b="0" l="0" r="0" t="0"/>
-            <wp:docPr id="9" name="image8.png"/>
-            <a:graphic>
-              <a:graphicData uri="http://schemas.openxmlformats.org/drawingml/2006/picture">
-                <pic:pic>
-                  <pic:nvPicPr>
-                    <pic:cNvPr id="0" name="image8.png"/>
-                    <pic:cNvPicPr preferRelativeResize="0"/>
-                  </pic:nvPicPr>
-                  <pic:blipFill>
-                    <a:blip r:embed="rId19"/>
+                    <a:blip r:embed="rId17"/>
                     <a:srcRect b="0" l="0" r="0" t="0"/>
                     <a:stretch>
                       <a:fillRect/>
@@ -3849,20 +4220,7 @@
           <w:rFonts w:ascii="Times New Roman" w:cs="Times New Roman" w:eastAsia="Times New Roman" w:hAnsi="Times New Roman"/>
           <w:rtl w:val="0"/>
         </w:rPr>
-        <w:t xml:space="preserve"> to persist key-value pairs, ensuring offline data accessibility. This experience deepened my understanding of CRUD operations and efficient local storage implementation, significantly enhancing the app's user experience and functionality.</w:t>
-      </w:r>
-    </w:p>
-    <w:p>
-      <w:pPr>
-        <w:spacing w:line="276" w:lineRule="auto"/>
-        <w:rPr>
-          <w:rFonts w:ascii="Times New Roman" w:cs="Times New Roman" w:eastAsia="Times New Roman" w:hAnsi="Times New Roman"/>
-        </w:rPr>
-      </w:pPr>
-      <w:r>
-        <w:rPr>
-          <w:rtl w:val="0"/>
-        </w:rPr>
+        <w:t xml:space="preserve"> to persist key-value pairs, ensuring offline data accessibility. This experience deepened my understanding of CRUD operations and efficient local storage implementation, significantly enhancing the app's user experience and functionality</w:t>
       </w:r>
     </w:p>
     <w:p>
@@ -3905,8 +4263,8 @@
       </w:r>
     </w:p>
     <w:sectPr>
-      <w:headerReference r:id="rId20" w:type="default"/>
-      <w:footerReference r:id="rId21" w:type="default"/>
+      <w:headerReference r:id="rId18" w:type="default"/>
+      <w:footerReference r:id="rId19" w:type="default"/>
       <w:pgSz w:h="20013" w:w="14173" w:orient="portrait"/>
       <w:pgMar w:bottom="1440.0000000000002" w:top="1440.0000000000002" w:left="1802.8346456692916" w:right="1802.8346456692916" w:header="720" w:footer="720"/>
       <w:pgNumType w:start="1"/>
@@ -4436,7 +4794,7 @@
 
 <file path=customXML/item1.xml><?xml version="1.0" encoding="utf-8"?>
 <go:gDocsCustomXmlDataStorage xmlns:go="http://customooxmlschemas.google.com/" xmlns:r="http://schemas.openxmlformats.org/officeDocument/2006/relationships" uri="GoogleDocsCustomDataVersion2">
-  <go:docsCustomData xmlns:go="http://customooxmlschemas.google.com/" roundtripDataSignature="AMtx7mhNQ0KAHzzQgMMDmVijVyYzizs2CA==">CgMxLjAyDmgucG5vNXU4Nzd0bjhpMg5oLmh3cXpsaXowMnN1dDIOaC54ZGsxMW5ycGQwanoyDmgucWVyNDkxMXcxcjFxMg5oLjZvM2gzZXdsNm91bTIOaC5lcWo5N2VkZ215a3YyDmguYm81ZWptdmRqMTE2Mg5oLnlodXJkb28za2I5cjIOaC43bmYwYmtob2NpcWUyDmguejd2ZGp2OHFwb3U2Mg5oLmYzMGM1dGxoMjA3MDIOaC4yam8zbXFybWs0cWEyDmgudGF3NHd3amNyczE5Mg5oLnhwYXBrdHkzYzN3cjIOaC5qanhkbjJoZTJlajkyDmguMXhwYncyamM0ZnByMg5oLms5dW04aG8zd3c5YzIOaC43dGVmejZzeW92c3MyDmgubmR2OW9hcnU5eG9sOAByITFoY0Z0eHNmVXFTT3Z3Nml3THRFeGFERWNZaE14RF9UQg==</go:docsCustomData>
+  <go:docsCustomData xmlns:go="http://customooxmlschemas.google.com/" roundtripDataSignature="AMtx7mhdFg89dTefmSnsgR9n7ecCkWzkYw==">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</go:docsCustomData>
 </go:gDocsCustomXmlDataStorage>
 </file>
 

</xml_diff>